<commit_message>
ERD Template in Draw.io
</commit_message>
<xml_diff>
--- a/Day 05/Joes_Video_Store_Normalization_View1.docx
+++ b/Day 05/Joes_Video_Store_Normalization_View1.docx
@@ -41,7 +41,25 @@
           <w:iCs/>
           <w:color w:val="555555"/>
         </w:rPr>
-        <w:t xml:space="preserve">Customer Rents Video  ·  Individual work </w:t>
+        <w:t xml:space="preserve">Customer Rents </w:t>
+      </w:r>
+      <w:proofErr w:type="gramStart"/>
+      <w:r>
+        <w:rPr>
+          <w:i/>
+          <w:iCs/>
+          <w:color w:val="555555"/>
+        </w:rPr>
+        <w:t>Video  ·</w:t>
+      </w:r>
+      <w:proofErr w:type="gramEnd"/>
+      <w:r>
+        <w:rPr>
+          <w:i/>
+          <w:iCs/>
+          <w:color w:val="555555"/>
+        </w:rPr>
+        <w:t xml:space="preserve">  Individual work </w:t>
       </w:r>
     </w:p>
     <w:p>
@@ -73,12 +91,6 @@
         <w:gridCol w:w="8640"/>
       </w:tblGrid>
       <w:tr>
-        <w:tblPrEx>
-          <w:tblCellMar>
-            <w:top w:w="0" w:type="dxa"/>
-            <w:bottom w:w="0" w:type="dxa"/>
-          </w:tblCellMar>
-        </w:tblPrEx>
         <w:tc>
           <w:tcPr>
             <w:tcW w:w="8640" w:type="dxa"/>
@@ -212,12 +224,6 @@
         <w:gridCol w:w="8640"/>
       </w:tblGrid>
       <w:tr>
-        <w:tblPrEx>
-          <w:tblCellMar>
-            <w:top w:w="0" w:type="dxa"/>
-            <w:bottom w:w="0" w:type="dxa"/>
-          </w:tblCellMar>
-        </w:tblPrEx>
         <w:tc>
           <w:tcPr>
             <w:tcW w:w="8640" w:type="dxa"/>
@@ -269,12 +275,6 @@
         <w:gridCol w:w="8640"/>
       </w:tblGrid>
       <w:tr>
-        <w:tblPrEx>
-          <w:tblCellMar>
-            <w:top w:w="0" w:type="dxa"/>
-            <w:bottom w:w="0" w:type="dxa"/>
-          </w:tblCellMar>
-        </w:tblPrEx>
         <w:tc>
           <w:tcPr>
             <w:tcW w:w="8640" w:type="dxa"/>
@@ -344,12 +344,6 @@
         <w:gridCol w:w="4320"/>
       </w:tblGrid>
       <w:tr>
-        <w:tblPrEx>
-          <w:tblCellMar>
-            <w:top w:w="0" w:type="dxa"/>
-            <w:bottom w:w="0" w:type="dxa"/>
-          </w:tblCellMar>
-        </w:tblPrEx>
         <w:tc>
           <w:tcPr>
             <w:tcW w:w="4320" w:type="dxa"/>
@@ -412,12 +406,6 @@
         </w:tc>
       </w:tr>
       <w:tr>
-        <w:tblPrEx>
-          <w:tblCellMar>
-            <w:top w:w="0" w:type="dxa"/>
-            <w:bottom w:w="0" w:type="dxa"/>
-          </w:tblCellMar>
-        </w:tblPrEx>
         <w:tc>
           <w:tcPr>
             <w:tcW w:w="4320" w:type="dxa"/>
@@ -480,12 +468,6 @@
         </w:tc>
       </w:tr>
       <w:tr>
-        <w:tblPrEx>
-          <w:tblCellMar>
-            <w:top w:w="0" w:type="dxa"/>
-            <w:bottom w:w="0" w:type="dxa"/>
-          </w:tblCellMar>
-        </w:tblPrEx>
         <w:tc>
           <w:tcPr>
             <w:tcW w:w="4320" w:type="dxa"/>
@@ -574,12 +556,6 @@
         <w:gridCol w:w="1140"/>
       </w:tblGrid>
       <w:tr>
-        <w:tblPrEx>
-          <w:tblCellMar>
-            <w:top w:w="0" w:type="dxa"/>
-            <w:bottom w:w="0" w:type="dxa"/>
-          </w:tblCellMar>
-        </w:tblPrEx>
         <w:tc>
           <w:tcPr>
             <w:tcW w:w="1400" w:type="dxa"/>
@@ -737,12 +713,6 @@
         </w:tc>
       </w:tr>
       <w:tr>
-        <w:tblPrEx>
-          <w:tblCellMar>
-            <w:top w:w="0" w:type="dxa"/>
-            <w:bottom w:w="0" w:type="dxa"/>
-          </w:tblCellMar>
-        </w:tblPrEx>
         <w:tc>
           <w:tcPr>
             <w:tcW w:w="1400" w:type="dxa"/>
@@ -885,12 +855,6 @@
         </w:tc>
       </w:tr>
       <w:tr>
-        <w:tblPrEx>
-          <w:tblCellMar>
-            <w:top w:w="0" w:type="dxa"/>
-            <w:bottom w:w="0" w:type="dxa"/>
-          </w:tblCellMar>
-        </w:tblPrEx>
         <w:tc>
           <w:tcPr>
             <w:tcW w:w="1400" w:type="dxa"/>
@@ -1033,12 +997,6 @@
         </w:tc>
       </w:tr>
       <w:tr>
-        <w:tblPrEx>
-          <w:tblCellMar>
-            <w:top w:w="0" w:type="dxa"/>
-            <w:bottom w:w="0" w:type="dxa"/>
-          </w:tblCellMar>
-        </w:tblPrEx>
         <w:tc>
           <w:tcPr>
             <w:tcW w:w="1400" w:type="dxa"/>
@@ -1119,7 +1077,25 @@
                 <w:sz w:val="18"/>
                 <w:szCs w:val="18"/>
               </w:rPr>
-              <w:t>As Good As It Gets</w:t>
+              <w:t xml:space="preserve">As Good </w:t>
+            </w:r>
+            <w:proofErr w:type="gramStart"/>
+            <w:r>
+              <w:rPr>
+                <w:color w:val="000000"/>
+                <w:sz w:val="18"/>
+                <w:szCs w:val="18"/>
+              </w:rPr>
+              <w:t>As</w:t>
+            </w:r>
+            <w:proofErr w:type="gramEnd"/>
+            <w:r>
+              <w:rPr>
+                <w:color w:val="000000"/>
+                <w:sz w:val="18"/>
+                <w:szCs w:val="18"/>
+              </w:rPr>
+              <w:t xml:space="preserve"> It Gets</w:t>
             </w:r>
           </w:p>
         </w:tc>
@@ -1208,12 +1184,6 @@
         <w:gridCol w:w="1600"/>
       </w:tblGrid>
       <w:tr>
-        <w:tblPrEx>
-          <w:tblCellMar>
-            <w:top w:w="0" w:type="dxa"/>
-            <w:bottom w:w="0" w:type="dxa"/>
-          </w:tblCellMar>
-        </w:tblPrEx>
         <w:tc>
           <w:tcPr>
             <w:tcW w:w="7040" w:type="dxa"/>
@@ -1278,12 +1248,6 @@
         </w:tc>
       </w:tr>
       <w:tr>
-        <w:tblPrEx>
-          <w:tblCellMar>
-            <w:top w:w="0" w:type="dxa"/>
-            <w:bottom w:w="0" w:type="dxa"/>
-          </w:tblCellMar>
-        </w:tblPrEx>
         <w:tc>
           <w:tcPr>
             <w:tcW w:w="7040" w:type="dxa"/>
@@ -1348,12 +1312,6 @@
         </w:tc>
       </w:tr>
       <w:tr>
-        <w:tblPrEx>
-          <w:tblCellMar>
-            <w:top w:w="0" w:type="dxa"/>
-            <w:bottom w:w="0" w:type="dxa"/>
-          </w:tblCellMar>
-        </w:tblPrEx>
         <w:tc>
           <w:tcPr>
             <w:tcW w:w="7040" w:type="dxa"/>
@@ -1422,12 +1380,6 @@
         </w:tc>
       </w:tr>
       <w:tr>
-        <w:tblPrEx>
-          <w:tblCellMar>
-            <w:top w:w="0" w:type="dxa"/>
-            <w:bottom w:w="0" w:type="dxa"/>
-          </w:tblCellMar>
-        </w:tblPrEx>
         <w:tc>
           <w:tcPr>
             <w:tcW w:w="8640" w:type="dxa"/>
@@ -1550,12 +1502,6 @@
         <w:gridCol w:w="8640"/>
       </w:tblGrid>
       <w:tr>
-        <w:tblPrEx>
-          <w:tblCellMar>
-            <w:top w:w="0" w:type="dxa"/>
-            <w:bottom w:w="0" w:type="dxa"/>
-          </w:tblCellMar>
-        </w:tblPrEx>
         <w:tc>
           <w:tcPr>
             <w:tcW w:w="8640" w:type="dxa"/>
@@ -1685,12 +1631,6 @@
         <w:gridCol w:w="8640"/>
       </w:tblGrid>
       <w:tr>
-        <w:tblPrEx>
-          <w:tblCellMar>
-            <w:top w:w="0" w:type="dxa"/>
-            <w:bottom w:w="0" w:type="dxa"/>
-          </w:tblCellMar>
-        </w:tblPrEx>
         <w:tc>
           <w:tcPr>
             <w:tcW w:w="8640" w:type="dxa"/>
@@ -1724,12 +1664,6 @@
         </w:tc>
       </w:tr>
       <w:tr>
-        <w:tblPrEx>
-          <w:tblCellMar>
-            <w:top w:w="0" w:type="dxa"/>
-            <w:bottom w:w="0" w:type="dxa"/>
-          </w:tblCellMar>
-        </w:tblPrEx>
         <w:tc>
           <w:tcPr>
             <w:tcW w:w="8640" w:type="dxa"/>
@@ -1760,12 +1694,6 @@
         </w:tc>
       </w:tr>
       <w:tr>
-        <w:tblPrEx>
-          <w:tblCellMar>
-            <w:top w:w="0" w:type="dxa"/>
-            <w:bottom w:w="0" w:type="dxa"/>
-          </w:tblCellMar>
-        </w:tblPrEx>
         <w:tc>
           <w:tcPr>
             <w:tcW w:w="8640" w:type="dxa"/>
@@ -1796,12 +1724,6 @@
         </w:tc>
       </w:tr>
       <w:tr>
-        <w:tblPrEx>
-          <w:tblCellMar>
-            <w:top w:w="0" w:type="dxa"/>
-            <w:bottom w:w="0" w:type="dxa"/>
-          </w:tblCellMar>
-        </w:tblPrEx>
         <w:tc>
           <w:tcPr>
             <w:tcW w:w="8640" w:type="dxa"/>
@@ -1832,12 +1754,6 @@
         </w:tc>
       </w:tr>
       <w:tr>
-        <w:tblPrEx>
-          <w:tblCellMar>
-            <w:top w:w="0" w:type="dxa"/>
-            <w:bottom w:w="0" w:type="dxa"/>
-          </w:tblCellMar>
-        </w:tblPrEx>
         <w:tc>
           <w:tcPr>
             <w:tcW w:w="8640" w:type="dxa"/>
@@ -1868,12 +1784,6 @@
         </w:tc>
       </w:tr>
       <w:tr>
-        <w:tblPrEx>
-          <w:tblCellMar>
-            <w:top w:w="0" w:type="dxa"/>
-            <w:bottom w:w="0" w:type="dxa"/>
-          </w:tblCellMar>
-        </w:tblPrEx>
         <w:tc>
           <w:tcPr>
             <w:tcW w:w="8640" w:type="dxa"/>
@@ -1904,12 +1814,6 @@
         </w:tc>
       </w:tr>
       <w:tr>
-        <w:tblPrEx>
-          <w:tblCellMar>
-            <w:top w:w="0" w:type="dxa"/>
-            <w:bottom w:w="0" w:type="dxa"/>
-          </w:tblCellMar>
-        </w:tblPrEx>
         <w:tc>
           <w:tcPr>
             <w:tcW w:w="8640" w:type="dxa"/>
@@ -1940,12 +1844,6 @@
         </w:tc>
       </w:tr>
       <w:tr>
-        <w:tblPrEx>
-          <w:tblCellMar>
-            <w:top w:w="0" w:type="dxa"/>
-            <w:bottom w:w="0" w:type="dxa"/>
-          </w:tblCellMar>
-        </w:tblPrEx>
         <w:tc>
           <w:tcPr>
             <w:tcW w:w="8640" w:type="dxa"/>
@@ -1976,12 +1874,6 @@
         </w:tc>
       </w:tr>
       <w:tr>
-        <w:tblPrEx>
-          <w:tblCellMar>
-            <w:top w:w="0" w:type="dxa"/>
-            <w:bottom w:w="0" w:type="dxa"/>
-          </w:tblCellMar>
-        </w:tblPrEx>
         <w:tc>
           <w:tcPr>
             <w:tcW w:w="8640" w:type="dxa"/>
@@ -2012,12 +1904,6 @@
         </w:tc>
       </w:tr>
       <w:tr>
-        <w:tblPrEx>
-          <w:tblCellMar>
-            <w:top w:w="0" w:type="dxa"/>
-            <w:bottom w:w="0" w:type="dxa"/>
-          </w:tblCellMar>
-        </w:tblPrEx>
         <w:tc>
           <w:tcPr>
             <w:tcW w:w="8640" w:type="dxa"/>
@@ -2048,12 +1934,6 @@
         </w:tc>
       </w:tr>
       <w:tr>
-        <w:tblPrEx>
-          <w:tblCellMar>
-            <w:top w:w="0" w:type="dxa"/>
-            <w:bottom w:w="0" w:type="dxa"/>
-          </w:tblCellMar>
-        </w:tblPrEx>
         <w:tc>
           <w:tcPr>
             <w:tcW w:w="8640" w:type="dxa"/>
@@ -2084,12 +1964,6 @@
         </w:tc>
       </w:tr>
       <w:tr>
-        <w:tblPrEx>
-          <w:tblCellMar>
-            <w:top w:w="0" w:type="dxa"/>
-            <w:bottom w:w="0" w:type="dxa"/>
-          </w:tblCellMar>
-        </w:tblPrEx>
         <w:tc>
           <w:tcPr>
             <w:tcW w:w="8640" w:type="dxa"/>
@@ -2120,12 +1994,6 @@
         </w:tc>
       </w:tr>
       <w:tr>
-        <w:tblPrEx>
-          <w:tblCellMar>
-            <w:top w:w="0" w:type="dxa"/>
-            <w:bottom w:w="0" w:type="dxa"/>
-          </w:tblCellMar>
-        </w:tblPrEx>
         <w:tc>
           <w:tcPr>
             <w:tcW w:w="8640" w:type="dxa"/>
@@ -2156,12 +2024,6 @@
         </w:tc>
       </w:tr>
       <w:tr>
-        <w:tblPrEx>
-          <w:tblCellMar>
-            <w:top w:w="0" w:type="dxa"/>
-            <w:bottom w:w="0" w:type="dxa"/>
-          </w:tblCellMar>
-        </w:tblPrEx>
         <w:tc>
           <w:tcPr>
             <w:tcW w:w="8640" w:type="dxa"/>
@@ -2192,12 +2054,6 @@
         </w:tc>
       </w:tr>
       <w:tr>
-        <w:tblPrEx>
-          <w:tblCellMar>
-            <w:top w:w="0" w:type="dxa"/>
-            <w:bottom w:w="0" w:type="dxa"/>
-          </w:tblCellMar>
-        </w:tblPrEx>
         <w:tc>
           <w:tcPr>
             <w:tcW w:w="8640" w:type="dxa"/>
@@ -2228,12 +2084,6 @@
         </w:tc>
       </w:tr>
       <w:tr>
-        <w:tblPrEx>
-          <w:tblCellMar>
-            <w:top w:w="0" w:type="dxa"/>
-            <w:bottom w:w="0" w:type="dxa"/>
-          </w:tblCellMar>
-        </w:tblPrEx>
         <w:tc>
           <w:tcPr>
             <w:tcW w:w="8640" w:type="dxa"/>
@@ -2264,12 +2114,6 @@
         </w:tc>
       </w:tr>
       <w:tr>
-        <w:tblPrEx>
-          <w:tblCellMar>
-            <w:top w:w="0" w:type="dxa"/>
-            <w:bottom w:w="0" w:type="dxa"/>
-          </w:tblCellMar>
-        </w:tblPrEx>
         <w:tc>
           <w:tcPr>
             <w:tcW w:w="8640" w:type="dxa"/>
@@ -2300,12 +2144,6 @@
         </w:tc>
       </w:tr>
       <w:tr>
-        <w:tblPrEx>
-          <w:tblCellMar>
-            <w:top w:w="0" w:type="dxa"/>
-            <w:bottom w:w="0" w:type="dxa"/>
-          </w:tblCellMar>
-        </w:tblPrEx>
         <w:tc>
           <w:tcPr>
             <w:tcW w:w="8640" w:type="dxa"/>
@@ -2362,12 +2200,6 @@
         <w:gridCol w:w="8640"/>
       </w:tblGrid>
       <w:tr>
-        <w:tblPrEx>
-          <w:tblCellMar>
-            <w:top w:w="0" w:type="dxa"/>
-            <w:bottom w:w="0" w:type="dxa"/>
-          </w:tblCellMar>
-        </w:tblPrEx>
         <w:tc>
           <w:tcPr>
             <w:tcW w:w="8640" w:type="dxa"/>
@@ -2427,16 +2259,10 @@
         <w:tblLook w:val="04A0" w:firstRow="1" w:lastRow="0" w:firstColumn="1" w:lastColumn="0" w:noHBand="0" w:noVBand="1"/>
       </w:tblPr>
       <w:tblGrid>
-        <w:gridCol w:w="252"/>
-        <w:gridCol w:w="8128"/>
+        <w:gridCol w:w="250"/>
+        <w:gridCol w:w="8130"/>
       </w:tblGrid>
       <w:tr>
-        <w:tblPrEx>
-          <w:tblCellMar>
-            <w:top w:w="0" w:type="dxa"/>
-            <w:bottom w:w="0" w:type="dxa"/>
-          </w:tblCellMar>
-        </w:tblPrEx>
         <w:trPr>
           <w:gridBefore w:val="1"/>
           <w:wBefore w:w="260" w:type="dxa"/>
@@ -2467,6 +2293,75 @@
             <w:r>
               <w:t xml:space="preserve"> </w:t>
             </w:r>
+            <w:proofErr w:type="gramStart"/>
+            <w:r>
+              <w:t>Transaction(</w:t>
+            </w:r>
+            <w:proofErr w:type="gramEnd"/>
+            <w:r>
+              <w:t xml:space="preserve">Transaction </w:t>
+            </w:r>
+            <w:proofErr w:type="gramStart"/>
+            <w:r>
+              <w:t>ID(</w:t>
+            </w:r>
+            <w:proofErr w:type="gramEnd"/>
+            <w:r>
+              <w:t>Transaction Date))</w:t>
+            </w:r>
+            <w:r>
+              <w:br/>
+            </w:r>
+            <w:r>
+              <w:br/>
+            </w:r>
+            <w:proofErr w:type="gramStart"/>
+            <w:r>
+              <w:t>Customer(</w:t>
+            </w:r>
+            <w:proofErr w:type="gramEnd"/>
+            <w:r>
+              <w:t xml:space="preserve">Customer </w:t>
+            </w:r>
+            <w:proofErr w:type="gramStart"/>
+            <w:r>
+              <w:t>ID(</w:t>
+            </w:r>
+            <w:proofErr w:type="gramEnd"/>
+            <w:r>
+              <w:t>Customer First Name, Customer Last Name, Customer Phone, Customer Street address, Customer City, Customer Province, Customer Postal Code</w:t>
+            </w:r>
+            <w:r>
+              <w:t>))</w:t>
+            </w:r>
+            <w:r>
+              <w:br/>
+            </w:r>
+            <w:r>
+              <w:br/>
+            </w:r>
+            <w:proofErr w:type="gramStart"/>
+            <w:r>
+              <w:t>Video(</w:t>
+            </w:r>
+            <w:proofErr w:type="gramEnd"/>
+            <w:r>
+              <w:t xml:space="preserve">Video </w:t>
+            </w:r>
+            <w:proofErr w:type="gramStart"/>
+            <w:r>
+              <w:t>ID(</w:t>
+            </w:r>
+            <w:proofErr w:type="gramEnd"/>
+            <w:r>
+              <w:t>Video Copy Number, Video Title, Video Return Date, Video Rental Charge Current, Video Rental Charge Historical, Transaction GST))</w:t>
+            </w:r>
+            <w:r>
+              <w:br/>
+            </w:r>
+            <w:r>
+              <w:br/>
+            </w:r>
           </w:p>
           <w:p>
             <w:pPr>
@@ -2475,9 +2370,6 @@
               </w:pBdr>
               <w:spacing w:after="220"/>
             </w:pPr>
-            <w:r>
-              <w:t xml:space="preserve"> </w:t>
-            </w:r>
           </w:p>
           <w:p>
             <w:pPr>
@@ -2486,9 +2378,6 @@
               </w:pBdr>
               <w:spacing w:after="220"/>
             </w:pPr>
-            <w:r>
-              <w:t xml:space="preserve"> </w:t>
-            </w:r>
           </w:p>
           <w:p>
             <w:pPr>
@@ -2501,15 +2390,20 @@
               <w:t xml:space="preserve"> </w:t>
             </w:r>
           </w:p>
+          <w:p>
+            <w:pPr>
+              <w:pBdr>
+                <w:bottom w:val="single" w:sz="4" w:space="1" w:color="B7B7B7"/>
+              </w:pBdr>
+              <w:spacing w:after="220"/>
+            </w:pPr>
+            <w:r>
+              <w:t xml:space="preserve"> </w:t>
+            </w:r>
+          </w:p>
         </w:tc>
       </w:tr>
       <w:tr>
-        <w:tblPrEx>
-          <w:tblCellMar>
-            <w:top w:w="0" w:type="dxa"/>
-            <w:bottom w:w="0" w:type="dxa"/>
-          </w:tblCellMar>
-        </w:tblPrEx>
         <w:tc>
           <w:tcPr>
             <w:tcW w:w="8640" w:type="dxa"/>
@@ -2537,6 +2431,7 @@
                 <w:sz w:val="24"/>
                 <w:szCs w:val="24"/>
               </w:rPr>
+              <w:lastRenderedPageBreak/>
               <w:t>Step 1 — Apply First Normal Form (1NF)</w:t>
             </w:r>
           </w:p>
@@ -2655,7 +2550,6 @@
           <w:iCs/>
           <w:color w:val="555555"/>
         </w:rPr>
-        <w:lastRenderedPageBreak/>
         <w:t xml:space="preserve">b.  </w:t>
       </w:r>
       <w:r>
@@ -2911,12 +2805,6 @@
         <w:gridCol w:w="8640"/>
       </w:tblGrid>
       <w:tr>
-        <w:tblPrEx>
-          <w:tblCellMar>
-            <w:top w:w="0" w:type="dxa"/>
-            <w:bottom w:w="0" w:type="dxa"/>
-          </w:tblCellMar>
-        </w:tblPrEx>
         <w:tc>
           <w:tcPr>
             <w:tcW w:w="8640" w:type="dxa"/>
@@ -3000,12 +2888,6 @@
         <w:gridCol w:w="8640"/>
       </w:tblGrid>
       <w:tr>
-        <w:tblPrEx>
-          <w:tblCellMar>
-            <w:top w:w="0" w:type="dxa"/>
-            <w:bottom w:w="0" w:type="dxa"/>
-          </w:tblCellMar>
-        </w:tblPrEx>
         <w:tc>
           <w:tcPr>
             <w:tcW w:w="8640" w:type="dxa"/>
@@ -3055,7 +2937,23 @@
           <w:b/>
           <w:bCs/>
         </w:rPr>
-        <w:t>Table 3: ??? (Do you need a separate Video table?)</w:t>
+        <w:t>Table 3</w:t>
+      </w:r>
+      <w:proofErr w:type="gramStart"/>
+      <w:r>
+        <w:rPr>
+          <w:b/>
+          <w:bCs/>
+        </w:rPr>
+        <w:t>: ???</w:t>
+      </w:r>
+      <w:proofErr w:type="gramEnd"/>
+      <w:r>
+        <w:rPr>
+          <w:b/>
+          <w:bCs/>
+        </w:rPr>
+        <w:t xml:space="preserve"> (Do you need a separate Video table?)</w:t>
       </w:r>
     </w:p>
     <w:tbl>
@@ -3082,12 +2980,6 @@
         <w:gridCol w:w="25"/>
       </w:tblGrid>
       <w:tr>
-        <w:tblPrEx>
-          <w:tblCellMar>
-            <w:top w:w="0" w:type="dxa"/>
-            <w:bottom w:w="0" w:type="dxa"/>
-          </w:tblCellMar>
-        </w:tblPrEx>
         <w:trPr>
           <w:gridBefore w:val="1"/>
           <w:wBefore w:w="25" w:type="dxa"/>
@@ -3121,12 +3013,6 @@
         </w:tc>
       </w:tr>
       <w:tr>
-        <w:tblPrEx>
-          <w:tblCellMar>
-            <w:top w:w="0" w:type="dxa"/>
-            <w:bottom w:w="0" w:type="dxa"/>
-          </w:tblCellMar>
-        </w:tblPrEx>
         <w:trPr>
           <w:gridAfter w:val="1"/>
           <w:wAfter w:w="25" w:type="dxa"/>
@@ -3209,12 +3095,6 @@
         <w:gridCol w:w="8640"/>
       </w:tblGrid>
       <w:tr>
-        <w:tblPrEx>
-          <w:tblCellMar>
-            <w:top w:w="0" w:type="dxa"/>
-            <w:bottom w:w="0" w:type="dxa"/>
-          </w:tblCellMar>
-        </w:tblPrEx>
         <w:tc>
           <w:tcPr>
             <w:tcW w:w="8640" w:type="dxa"/>
@@ -3315,12 +3195,6 @@
         <w:gridCol w:w="1620"/>
       </w:tblGrid>
       <w:tr>
-        <w:tblPrEx>
-          <w:tblCellMar>
-            <w:top w:w="0" w:type="dxa"/>
-            <w:bottom w:w="0" w:type="dxa"/>
-          </w:tblCellMar>
-        </w:tblPrEx>
         <w:tc>
           <w:tcPr>
             <w:tcW w:w="2160" w:type="dxa"/>
@@ -3348,6 +3222,7 @@
                 <w:sz w:val="16"/>
                 <w:szCs w:val="16"/>
               </w:rPr>
+              <w:lastRenderedPageBreak/>
               <w:t>Attribute</w:t>
             </w:r>
           </w:p>
@@ -3478,12 +3353,6 @@
         </w:tc>
       </w:tr>
       <w:tr>
-        <w:tblPrEx>
-          <w:tblCellMar>
-            <w:top w:w="0" w:type="dxa"/>
-            <w:bottom w:w="0" w:type="dxa"/>
-          </w:tblCellMar>
-        </w:tblPrEx>
         <w:tc>
           <w:tcPr>
             <w:tcW w:w="2160" w:type="dxa"/>
@@ -3626,12 +3495,6 @@
         </w:tc>
       </w:tr>
       <w:tr>
-        <w:tblPrEx>
-          <w:tblCellMar>
-            <w:top w:w="0" w:type="dxa"/>
-            <w:bottom w:w="0" w:type="dxa"/>
-          </w:tblCellMar>
-        </w:tblPrEx>
         <w:tc>
           <w:tcPr>
             <w:tcW w:w="2160" w:type="dxa"/>
@@ -3774,12 +3637,6 @@
         </w:tc>
       </w:tr>
       <w:tr>
-        <w:tblPrEx>
-          <w:tblCellMar>
-            <w:top w:w="0" w:type="dxa"/>
-            <w:bottom w:w="0" w:type="dxa"/>
-          </w:tblCellMar>
-        </w:tblPrEx>
         <w:tc>
           <w:tcPr>
             <w:tcW w:w="2160" w:type="dxa"/>
@@ -3922,12 +3779,6 @@
         </w:tc>
       </w:tr>
       <w:tr>
-        <w:tblPrEx>
-          <w:tblCellMar>
-            <w:top w:w="0" w:type="dxa"/>
-            <w:bottom w:w="0" w:type="dxa"/>
-          </w:tblCellMar>
-        </w:tblPrEx>
         <w:tc>
           <w:tcPr>
             <w:tcW w:w="2160" w:type="dxa"/>
@@ -4086,7 +3937,6 @@
           <w:bCs/>
           <w:color w:val="1F3864"/>
         </w:rPr>
-        <w:lastRenderedPageBreak/>
         <w:t xml:space="preserve">2.  </w:t>
       </w:r>
       <w:r>
@@ -4234,12 +4084,6 @@
         <w:gridCol w:w="8640"/>
       </w:tblGrid>
       <w:tr>
-        <w:tblPrEx>
-          <w:tblCellMar>
-            <w:top w:w="0" w:type="dxa"/>
-            <w:bottom w:w="0" w:type="dxa"/>
-          </w:tblCellMar>
-        </w:tblPrEx>
         <w:tc>
           <w:tcPr>
             <w:tcW w:w="8640" w:type="dxa"/>
@@ -4323,12 +4167,6 @@
         <w:gridCol w:w="8640"/>
       </w:tblGrid>
       <w:tr>
-        <w:tblPrEx>
-          <w:tblCellMar>
-            <w:top w:w="0" w:type="dxa"/>
-            <w:bottom w:w="0" w:type="dxa"/>
-          </w:tblCellMar>
-        </w:tblPrEx>
         <w:tc>
           <w:tcPr>
             <w:tcW w:w="8640" w:type="dxa"/>
@@ -4402,12 +4240,6 @@
         <w:gridCol w:w="8640"/>
       </w:tblGrid>
       <w:tr>
-        <w:tblPrEx>
-          <w:tblCellMar>
-            <w:top w:w="0" w:type="dxa"/>
-            <w:bottom w:w="0" w:type="dxa"/>
-          </w:tblCellMar>
-        </w:tblPrEx>
         <w:tc>
           <w:tcPr>
             <w:tcW w:w="8640" w:type="dxa"/>
@@ -4438,12 +4270,6 @@
         </w:tc>
       </w:tr>
       <w:tr>
-        <w:tblPrEx>
-          <w:tblCellMar>
-            <w:top w:w="0" w:type="dxa"/>
-            <w:bottom w:w="0" w:type="dxa"/>
-          </w:tblCellMar>
-        </w:tblPrEx>
         <w:tc>
           <w:tcPr>
             <w:tcW w:w="8640" w:type="dxa"/>
@@ -4521,12 +4347,6 @@
         <w:gridCol w:w="8640"/>
       </w:tblGrid>
       <w:tr>
-        <w:tblPrEx>
-          <w:tblCellMar>
-            <w:top w:w="0" w:type="dxa"/>
-            <w:bottom w:w="0" w:type="dxa"/>
-          </w:tblCellMar>
-        </w:tblPrEx>
         <w:tc>
           <w:tcPr>
             <w:tcW w:w="8640" w:type="dxa"/>
@@ -4612,12 +4432,6 @@
         <w:gridCol w:w="2460"/>
       </w:tblGrid>
       <w:tr>
-        <w:tblPrEx>
-          <w:tblCellMar>
-            <w:top w:w="0" w:type="dxa"/>
-            <w:bottom w:w="0" w:type="dxa"/>
-          </w:tblCellMar>
-        </w:tblPrEx>
         <w:tc>
           <w:tcPr>
             <w:tcW w:w="1560" w:type="dxa"/>
@@ -4713,12 +4527,6 @@
         </w:tc>
       </w:tr>
       <w:tr>
-        <w:tblPrEx>
-          <w:tblCellMar>
-            <w:top w:w="0" w:type="dxa"/>
-            <w:bottom w:w="0" w:type="dxa"/>
-          </w:tblCellMar>
-        </w:tblPrEx>
         <w:tc>
           <w:tcPr>
             <w:tcW w:w="1560" w:type="dxa"/>
@@ -4805,12 +4613,6 @@
         </w:tc>
       </w:tr>
       <w:tr>
-        <w:tblPrEx>
-          <w:tblCellMar>
-            <w:top w:w="0" w:type="dxa"/>
-            <w:bottom w:w="0" w:type="dxa"/>
-          </w:tblCellMar>
-        </w:tblPrEx>
         <w:tc>
           <w:tcPr>
             <w:tcW w:w="1560" w:type="dxa"/>
@@ -4897,12 +4699,6 @@
         </w:tc>
       </w:tr>
       <w:tr>
-        <w:tblPrEx>
-          <w:tblCellMar>
-            <w:top w:w="0" w:type="dxa"/>
-            <w:bottom w:w="0" w:type="dxa"/>
-          </w:tblCellMar>
-        </w:tblPrEx>
         <w:tc>
           <w:tcPr>
             <w:tcW w:w="1560" w:type="dxa"/>
@@ -5024,6 +4820,7 @@
           <w:iCs/>
           <w:color w:val="555555"/>
         </w:rPr>
+        <w:lastRenderedPageBreak/>
         <w:t xml:space="preserve">a.  </w:t>
       </w:r>
       <w:r>
@@ -5176,12 +4973,6 @@
         <w:gridCol w:w="8640"/>
       </w:tblGrid>
       <w:tr>
-        <w:tblPrEx>
-          <w:tblCellMar>
-            <w:top w:w="0" w:type="dxa"/>
-            <w:bottom w:w="0" w:type="dxa"/>
-          </w:tblCellMar>
-        </w:tblPrEx>
         <w:tc>
           <w:tcPr>
             <w:tcW w:w="8640" w:type="dxa"/>
@@ -5206,7 +4997,6 @@
                 <w:sz w:val="18"/>
                 <w:szCs w:val="18"/>
               </w:rPr>
-              <w:lastRenderedPageBreak/>
               <w:t>Transaction ID (PK), Transaction Date, Customer ID (FK), Transaction GST</w:t>
             </w:r>
           </w:p>
@@ -5246,12 +5036,6 @@
         <w:gridCol w:w="8640"/>
       </w:tblGrid>
       <w:tr>
-        <w:tblPrEx>
-          <w:tblCellMar>
-            <w:top w:w="0" w:type="dxa"/>
-            <w:bottom w:w="0" w:type="dxa"/>
-          </w:tblCellMar>
-        </w:tblPrEx>
         <w:tc>
           <w:tcPr>
             <w:tcW w:w="8640" w:type="dxa"/>
@@ -5325,12 +5109,6 @@
         <w:gridCol w:w="8640"/>
       </w:tblGrid>
       <w:tr>
-        <w:tblPrEx>
-          <w:tblCellMar>
-            <w:top w:w="0" w:type="dxa"/>
-            <w:bottom w:w="0" w:type="dxa"/>
-          </w:tblCellMar>
-        </w:tblPrEx>
         <w:tc>
           <w:tcPr>
             <w:tcW w:w="8640" w:type="dxa"/>
@@ -5404,12 +5182,6 @@
         <w:gridCol w:w="8640"/>
       </w:tblGrid>
       <w:tr>
-        <w:tblPrEx>
-          <w:tblCellMar>
-            <w:top w:w="0" w:type="dxa"/>
-            <w:bottom w:w="0" w:type="dxa"/>
-          </w:tblCellMar>
-        </w:tblPrEx>
         <w:tc>
           <w:tcPr>
             <w:tcW w:w="8640" w:type="dxa"/>
@@ -5440,12 +5212,6 @@
         </w:tc>
       </w:tr>
       <w:tr>
-        <w:tblPrEx>
-          <w:tblCellMar>
-            <w:top w:w="0" w:type="dxa"/>
-            <w:bottom w:w="0" w:type="dxa"/>
-          </w:tblCellMar>
-        </w:tblPrEx>
         <w:tc>
           <w:tcPr>
             <w:tcW w:w="8640" w:type="dxa"/>
@@ -5612,6 +5378,7 @@
         <w:rPr>
           <w:noProof/>
         </w:rPr>
+        <w:lastRenderedPageBreak/>
         <w:drawing>
           <wp:inline distT="0" distB="0" distL="0" distR="0" wp14:anchorId="347A62D7" wp14:editId="7CB2E82A">
             <wp:extent cx="6393180" cy="4259580"/>
@@ -5671,7 +5438,6 @@
           <w:b/>
           <w:bCs/>
         </w:rPr>
-        <w:lastRenderedPageBreak/>
         <w:t>Relationships</w:t>
       </w:r>
     </w:p>
@@ -5699,12 +5465,6 @@
         <w:gridCol w:w="1440"/>
       </w:tblGrid>
       <w:tr>
-        <w:tblPrEx>
-          <w:tblCellMar>
-            <w:top w:w="0" w:type="dxa"/>
-            <w:bottom w:w="0" w:type="dxa"/>
-          </w:tblCellMar>
-        </w:tblPrEx>
         <w:tc>
           <w:tcPr>
             <w:tcW w:w="2160" w:type="dxa"/>
@@ -5831,12 +5591,6 @@
         </w:tc>
       </w:tr>
       <w:tr>
-        <w:tblPrEx>
-          <w:tblCellMar>
-            <w:top w:w="0" w:type="dxa"/>
-            <w:bottom w:w="0" w:type="dxa"/>
-          </w:tblCellMar>
-        </w:tblPrEx>
         <w:tc>
           <w:tcPr>
             <w:tcW w:w="2160" w:type="dxa"/>
@@ -5951,12 +5705,6 @@
         </w:tc>
       </w:tr>
       <w:tr>
-        <w:tblPrEx>
-          <w:tblCellMar>
-            <w:top w:w="0" w:type="dxa"/>
-            <w:bottom w:w="0" w:type="dxa"/>
-          </w:tblCellMar>
-        </w:tblPrEx>
         <w:tc>
           <w:tcPr>
             <w:tcW w:w="2160" w:type="dxa"/>
@@ -6071,12 +5819,6 @@
         </w:tc>
       </w:tr>
       <w:tr>
-        <w:tblPrEx>
-          <w:tblCellMar>
-            <w:top w:w="0" w:type="dxa"/>
-            <w:bottom w:w="0" w:type="dxa"/>
-          </w:tblCellMar>
-        </w:tblPrEx>
         <w:tc>
           <w:tcPr>
             <w:tcW w:w="2160" w:type="dxa"/>
@@ -6191,12 +5933,6 @@
         </w:tc>
       </w:tr>
       <w:tr>
-        <w:tblPrEx>
-          <w:tblCellMar>
-            <w:top w:w="0" w:type="dxa"/>
-            <w:bottom w:w="0" w:type="dxa"/>
-          </w:tblCellMar>
-        </w:tblPrEx>
         <w:tc>
           <w:tcPr>
             <w:tcW w:w="8640" w:type="dxa"/>
@@ -6264,7 +6000,15 @@
         <w:t xml:space="preserve">1.  </w:t>
       </w:r>
       <w:r>
-        <w:t>A transaction can contain multiple videos (M:N relationship between Transaction and Video).</w:t>
+        <w:t>A transaction can contain multiple videos (</w:t>
+      </w:r>
+      <w:proofErr w:type="gramStart"/>
+      <w:r>
+        <w:t>M:N</w:t>
+      </w:r>
+      <w:proofErr w:type="gramEnd"/>
+      <w:r>
+        <w:t xml:space="preserve"> relationship between Transaction and Video).</w:t>
       </w:r>
     </w:p>
     <w:p>
@@ -6370,12 +6114,6 @@
         <w:gridCol w:w="8127"/>
       </w:tblGrid>
       <w:tr>
-        <w:tblPrEx>
-          <w:tblCellMar>
-            <w:top w:w="0" w:type="dxa"/>
-            <w:bottom w:w="0" w:type="dxa"/>
-          </w:tblCellMar>
-        </w:tblPrEx>
         <w:trPr>
           <w:gridBefore w:val="1"/>
           <w:wBefore w:w="260" w:type="dxa"/>
@@ -6437,6 +6175,7 @@
               <w:spacing w:after="220"/>
             </w:pPr>
             <w:r>
+              <w:lastRenderedPageBreak/>
               <w:t xml:space="preserve"> </w:t>
             </w:r>
           </w:p>
@@ -6454,12 +6193,6 @@
         </w:tc>
       </w:tr>
       <w:tr>
-        <w:tblPrEx>
-          <w:tblCellMar>
-            <w:top w:w="0" w:type="dxa"/>
-            <w:bottom w:w="0" w:type="dxa"/>
-          </w:tblCellMar>
-        </w:tblPrEx>
         <w:tc>
           <w:tcPr>
             <w:tcW w:w="8640" w:type="dxa"/>
@@ -6487,6 +6220,7 @@
                 <w:sz w:val="24"/>
                 <w:szCs w:val="24"/>
               </w:rPr>
+              <w:lastRenderedPageBreak/>
               <w:t>Submission Requirements</w:t>
             </w:r>
           </w:p>
@@ -6693,12 +6427,6 @@
         <w:gridCol w:w="6240"/>
       </w:tblGrid>
       <w:tr>
-        <w:tblPrEx>
-          <w:tblCellMar>
-            <w:top w:w="0" w:type="dxa"/>
-            <w:bottom w:w="0" w:type="dxa"/>
-          </w:tblCellMar>
-        </w:tblPrEx>
         <w:tc>
           <w:tcPr>
             <w:tcW w:w="8640" w:type="dxa"/>
@@ -6732,12 +6460,6 @@
         </w:tc>
       </w:tr>
       <w:tr>
-        <w:tblPrEx>
-          <w:tblCellMar>
-            <w:top w:w="0" w:type="dxa"/>
-            <w:bottom w:w="0" w:type="dxa"/>
-          </w:tblCellMar>
-        </w:tblPrEx>
         <w:tc>
           <w:tcPr>
             <w:tcW w:w="2400" w:type="dxa"/>
@@ -6802,12 +6524,6 @@
         </w:tc>
       </w:tr>
       <w:tr>
-        <w:tblPrEx>
-          <w:tblCellMar>
-            <w:top w:w="0" w:type="dxa"/>
-            <w:bottom w:w="0" w:type="dxa"/>
-          </w:tblCellMar>
-        </w:tblPrEx>
         <w:tc>
           <w:tcPr>
             <w:tcW w:w="2400" w:type="dxa"/>
@@ -6866,12 +6582,6 @@
         </w:tc>
       </w:tr>
       <w:tr>
-        <w:tblPrEx>
-          <w:tblCellMar>
-            <w:top w:w="0" w:type="dxa"/>
-            <w:bottom w:w="0" w:type="dxa"/>
-          </w:tblCellMar>
-        </w:tblPrEx>
         <w:tc>
           <w:tcPr>
             <w:tcW w:w="2400" w:type="dxa"/>
@@ -6930,12 +6640,6 @@
         </w:tc>
       </w:tr>
       <w:tr>
-        <w:tblPrEx>
-          <w:tblCellMar>
-            <w:top w:w="0" w:type="dxa"/>
-            <w:bottom w:w="0" w:type="dxa"/>
-          </w:tblCellMar>
-        </w:tblPrEx>
         <w:tc>
           <w:tcPr>
             <w:tcW w:w="2400" w:type="dxa"/>
@@ -6960,7 +6664,6 @@
                 <w:sz w:val="18"/>
                 <w:szCs w:val="18"/>
               </w:rPr>
-              <w:lastRenderedPageBreak/>
               <w:t>Parentheses for repeating groups</w:t>
             </w:r>
           </w:p>
@@ -6995,12 +6698,6 @@
         </w:tc>
       </w:tr>
       <w:tr>
-        <w:tblPrEx>
-          <w:tblCellMar>
-            <w:top w:w="0" w:type="dxa"/>
-            <w:bottom w:w="0" w:type="dxa"/>
-          </w:tblCellMar>
-        </w:tblPrEx>
         <w:tc>
           <w:tcPr>
             <w:tcW w:w="2400" w:type="dxa"/>
@@ -7059,12 +6756,6 @@
         </w:tc>
       </w:tr>
       <w:tr>
-        <w:tblPrEx>
-          <w:tblCellMar>
-            <w:top w:w="0" w:type="dxa"/>
-            <w:bottom w:w="0" w:type="dxa"/>
-          </w:tblCellMar>
-        </w:tblPrEx>
         <w:tc>
           <w:tcPr>
             <w:tcW w:w="2400" w:type="dxa"/>
@@ -7117,18 +6808,30 @@
                 <w:sz w:val="18"/>
                 <w:szCs w:val="18"/>
               </w:rPr>
-              <w:t>Copy the PK as a FK.</w:t>
+              <w:t xml:space="preserve">Copy the PK as </w:t>
+            </w:r>
+            <w:proofErr w:type="gramStart"/>
+            <w:r>
+              <w:rPr>
+                <w:color w:val="000000"/>
+                <w:sz w:val="18"/>
+                <w:szCs w:val="18"/>
+              </w:rPr>
+              <w:t>a</w:t>
+            </w:r>
+            <w:proofErr w:type="gramEnd"/>
+            <w:r>
+              <w:rPr>
+                <w:color w:val="000000"/>
+                <w:sz w:val="18"/>
+                <w:szCs w:val="18"/>
+              </w:rPr>
+              <w:t xml:space="preserve"> FK.</w:t>
             </w:r>
           </w:p>
         </w:tc>
       </w:tr>
       <w:tr>
-        <w:tblPrEx>
-          <w:tblCellMar>
-            <w:top w:w="0" w:type="dxa"/>
-            <w:bottom w:w="0" w:type="dxa"/>
-          </w:tblCellMar>
-        </w:tblPrEx>
         <w:tc>
           <w:tcPr>
             <w:tcW w:w="2400" w:type="dxa"/>
@@ -7187,12 +6890,6 @@
         </w:tc>
       </w:tr>
       <w:tr>
-        <w:tblPrEx>
-          <w:tblCellMar>
-            <w:top w:w="0" w:type="dxa"/>
-            <w:bottom w:w="0" w:type="dxa"/>
-          </w:tblCellMar>
-        </w:tblPrEx>
         <w:tc>
           <w:tcPr>
             <w:tcW w:w="2400" w:type="dxa"/>
@@ -7251,12 +6948,6 @@
         </w:tc>
       </w:tr>
       <w:tr>
-        <w:tblPrEx>
-          <w:tblCellMar>
-            <w:top w:w="0" w:type="dxa"/>
-            <w:bottom w:w="0" w:type="dxa"/>
-          </w:tblCellMar>
-        </w:tblPrEx>
         <w:tc>
           <w:tcPr>
             <w:tcW w:w="2400" w:type="dxa"/>
@@ -7315,12 +7006,6 @@
         </w:tc>
       </w:tr>
       <w:tr>
-        <w:tblPrEx>
-          <w:tblCellMar>
-            <w:top w:w="0" w:type="dxa"/>
-            <w:bottom w:w="0" w:type="dxa"/>
-          </w:tblCellMar>
-        </w:tblPrEx>
         <w:tc>
           <w:tcPr>
             <w:tcW w:w="2400" w:type="dxa"/>
@@ -7373,7 +7058,25 @@
                 <w:sz w:val="18"/>
                 <w:szCs w:val="18"/>
               </w:rPr>
-              <w:t>If you had to make a decision (e.g., "a transaction can have many videos"), write it down.</w:t>
+              <w:t xml:space="preserve">If you had to </w:t>
+            </w:r>
+            <w:proofErr w:type="gramStart"/>
+            <w:r>
+              <w:rPr>
+                <w:color w:val="000000"/>
+                <w:sz w:val="18"/>
+                <w:szCs w:val="18"/>
+              </w:rPr>
+              <w:t>make a decision</w:t>
+            </w:r>
+            <w:proofErr w:type="gramEnd"/>
+            <w:r>
+              <w:rPr>
+                <w:color w:val="000000"/>
+                <w:sz w:val="18"/>
+                <w:szCs w:val="18"/>
+              </w:rPr>
+              <w:t xml:space="preserve"> (e.g., "a transaction can have many videos"), write it down.</w:t>
             </w:r>
           </w:p>
         </w:tc>
@@ -7406,12 +7109,6 @@
         <w:gridCol w:w="5240"/>
       </w:tblGrid>
       <w:tr>
-        <w:tblPrEx>
-          <w:tblCellMar>
-            <w:top w:w="0" w:type="dxa"/>
-            <w:bottom w:w="0" w:type="dxa"/>
-          </w:tblCellMar>
-        </w:tblPrEx>
         <w:tc>
           <w:tcPr>
             <w:tcW w:w="8640" w:type="dxa"/>
@@ -7445,12 +7142,6 @@
         </w:tc>
       </w:tr>
       <w:tr>
-        <w:tblPrEx>
-          <w:tblCellMar>
-            <w:top w:w="0" w:type="dxa"/>
-            <w:bottom w:w="0" w:type="dxa"/>
-          </w:tblCellMar>
-        </w:tblPrEx>
         <w:tc>
           <w:tcPr>
             <w:tcW w:w="3400" w:type="dxa"/>
@@ -7515,12 +7206,6 @@
         </w:tc>
       </w:tr>
       <w:tr>
-        <w:tblPrEx>
-          <w:tblCellMar>
-            <w:top w:w="0" w:type="dxa"/>
-            <w:bottom w:w="0" w:type="dxa"/>
-          </w:tblCellMar>
-        </w:tblPrEx>
         <w:tc>
           <w:tcPr>
             <w:tcW w:w="3400" w:type="dxa"/>
@@ -7579,12 +7264,6 @@
         </w:tc>
       </w:tr>
       <w:tr>
-        <w:tblPrEx>
-          <w:tblCellMar>
-            <w:top w:w="0" w:type="dxa"/>
-            <w:bottom w:w="0" w:type="dxa"/>
-          </w:tblCellMar>
-        </w:tblPrEx>
         <w:tc>
           <w:tcPr>
             <w:tcW w:w="3400" w:type="dxa"/>
@@ -7643,12 +7322,6 @@
         </w:tc>
       </w:tr>
       <w:tr>
-        <w:tblPrEx>
-          <w:tblCellMar>
-            <w:top w:w="0" w:type="dxa"/>
-            <w:bottom w:w="0" w:type="dxa"/>
-          </w:tblCellMar>
-        </w:tblPrEx>
         <w:tc>
           <w:tcPr>
             <w:tcW w:w="3400" w:type="dxa"/>
@@ -7707,12 +7380,6 @@
         </w:tc>
       </w:tr>
       <w:tr>
-        <w:tblPrEx>
-          <w:tblCellMar>
-            <w:top w:w="0" w:type="dxa"/>
-            <w:bottom w:w="0" w:type="dxa"/>
-          </w:tblCellMar>
-        </w:tblPrEx>
         <w:tc>
           <w:tcPr>
             <w:tcW w:w="3400" w:type="dxa"/>
@@ -7737,6 +7404,7 @@
                 <w:sz w:val="18"/>
                 <w:szCs w:val="18"/>
               </w:rPr>
+              <w:lastRenderedPageBreak/>
               <w:t>Missing a partial dependency</w:t>
             </w:r>
           </w:p>
@@ -7771,12 +7439,6 @@
         </w:tc>
       </w:tr>
       <w:tr>
-        <w:tblPrEx>
-          <w:tblCellMar>
-            <w:top w:w="0" w:type="dxa"/>
-            <w:bottom w:w="0" w:type="dxa"/>
-          </w:tblCellMar>
-        </w:tblPrEx>
         <w:tc>
           <w:tcPr>
             <w:tcW w:w="3400" w:type="dxa"/>
@@ -7835,12 +7497,6 @@
         </w:tc>
       </w:tr>
       <w:tr>
-        <w:tblPrEx>
-          <w:tblCellMar>
-            <w:top w:w="0" w:type="dxa"/>
-            <w:bottom w:w="0" w:type="dxa"/>
-          </w:tblCellMar>
-        </w:tblPrEx>
         <w:tc>
           <w:tcPr>
             <w:tcW w:w="3400" w:type="dxa"/>
@@ -7893,18 +7549,30 @@
                 <w:sz w:val="18"/>
                 <w:szCs w:val="18"/>
               </w:rPr>
-              <w:t>Every relationship needs a FK in the child table.</w:t>
+              <w:t xml:space="preserve">Every relationship needs </w:t>
+            </w:r>
+            <w:proofErr w:type="gramStart"/>
+            <w:r>
+              <w:rPr>
+                <w:color w:val="000000"/>
+                <w:sz w:val="18"/>
+                <w:szCs w:val="18"/>
+              </w:rPr>
+              <w:t>a</w:t>
+            </w:r>
+            <w:proofErr w:type="gramEnd"/>
+            <w:r>
+              <w:rPr>
+                <w:color w:val="000000"/>
+                <w:sz w:val="18"/>
+                <w:szCs w:val="18"/>
+              </w:rPr>
+              <w:t xml:space="preserve"> FK in the child table.</w:t>
             </w:r>
           </w:p>
         </w:tc>
       </w:tr>
       <w:tr>
-        <w:tblPrEx>
-          <w:tblCellMar>
-            <w:top w:w="0" w:type="dxa"/>
-            <w:bottom w:w="0" w:type="dxa"/>
-          </w:tblCellMar>
-        </w:tblPrEx>
         <w:tc>
           <w:tcPr>
             <w:tcW w:w="3400" w:type="dxa"/>
@@ -7989,12 +7657,6 @@
         <w:gridCol w:w="8640"/>
       </w:tblGrid>
       <w:tr>
-        <w:tblPrEx>
-          <w:tblCellMar>
-            <w:top w:w="0" w:type="dxa"/>
-            <w:bottom w:w="0" w:type="dxa"/>
-          </w:tblCellMar>
-        </w:tblPrEx>
         <w:tc>
           <w:tcPr>
             <w:tcW w:w="8640" w:type="dxa"/>
@@ -8060,12 +7722,6 @@
         <w:gridCol w:w="8640"/>
       </w:tblGrid>
       <w:tr>
-        <w:tblPrEx>
-          <w:tblCellMar>
-            <w:top w:w="0" w:type="dxa"/>
-            <w:bottom w:w="0" w:type="dxa"/>
-          </w:tblCellMar>
-        </w:tblPrEx>
         <w:tc>
           <w:tcPr>
             <w:tcW w:w="8640" w:type="dxa"/>
@@ -8084,13 +7740,23 @@
             </w:tcMar>
           </w:tcPr>
           <w:p>
+            <w:proofErr w:type="gramStart"/>
             <w:r>
               <w:rPr>
                 <w:rFonts w:ascii="Courier New" w:eastAsia="Courier New" w:hAnsi="Courier New" w:cs="Courier New"/>
                 <w:sz w:val="18"/>
                 <w:szCs w:val="18"/>
               </w:rPr>
-              <w:t>Transaction(Transaction ID, Transaction Date, Customer ID, Customer First Name,</w:t>
+              <w:t>Transaction(</w:t>
+            </w:r>
+            <w:proofErr w:type="gramEnd"/>
+            <w:r>
+              <w:rPr>
+                <w:rFonts w:ascii="Courier New" w:eastAsia="Courier New" w:hAnsi="Courier New" w:cs="Courier New"/>
+                <w:sz w:val="18"/>
+                <w:szCs w:val="18"/>
+              </w:rPr>
+              <w:t>Transaction ID, Transaction Date, Customer ID, Customer First Name,</w:t>
             </w:r>
           </w:p>
           <w:p>
@@ -8169,12 +7835,6 @@
         <w:gridCol w:w="8640"/>
       </w:tblGrid>
       <w:tr>
-        <w:tblPrEx>
-          <w:tblCellMar>
-            <w:top w:w="0" w:type="dxa"/>
-            <w:bottom w:w="0" w:type="dxa"/>
-          </w:tblCellMar>
-        </w:tblPrEx>
         <w:tc>
           <w:tcPr>
             <w:tcW w:w="8640" w:type="dxa"/>
@@ -8193,22 +7853,32 @@
             </w:tcMar>
           </w:tcPr>
           <w:p>
+            <w:proofErr w:type="gramStart"/>
             <w:r>
               <w:rPr>
                 <w:rFonts w:ascii="Courier New" w:eastAsia="Courier New" w:hAnsi="Courier New" w:cs="Courier New"/>
                 <w:sz w:val="18"/>
                 <w:szCs w:val="18"/>
               </w:rPr>
-              <w:t>Transaction(Transaction ID, Transaction Date, Customer ID, Customer First Name,</w:t>
-            </w:r>
-          </w:p>
-          <w:p>
+              <w:t>Transaction(</w:t>
+            </w:r>
+            <w:proofErr w:type="gramEnd"/>
             <w:r>
               <w:rPr>
                 <w:rFonts w:ascii="Courier New" w:eastAsia="Courier New" w:hAnsi="Courier New" w:cs="Courier New"/>
                 <w:sz w:val="18"/>
                 <w:szCs w:val="18"/>
               </w:rPr>
+              <w:t>Transaction ID, Transaction Date, Customer ID, Customer First Name,</w:t>
+            </w:r>
+          </w:p>
+          <w:p>
+            <w:r>
+              <w:rPr>
+                <w:rFonts w:ascii="Courier New" w:eastAsia="Courier New" w:hAnsi="Courier New" w:cs="Courier New"/>
+                <w:sz w:val="18"/>
+                <w:szCs w:val="18"/>
+              </w:rPr>
               <w:t>Customer Last Name, Customer Phone, Customer Street Address, Customer City,</w:t>
             </w:r>
           </w:p>
@@ -8234,6 +7904,7 @@
           </w:p>
           <w:p>
             <w:proofErr w:type="spellStart"/>
+            <w:proofErr w:type="gramStart"/>
             <w:r>
               <w:rPr>
                 <w:rFonts w:ascii="Courier New" w:eastAsia="Courier New" w:hAnsi="Courier New" w:cs="Courier New"/>
@@ -8249,17 +7920,25 @@
                 <w:sz w:val="18"/>
                 <w:szCs w:val="18"/>
               </w:rPr>
-              <w:t>(Transaction ID (FK), Video ID, Video Copy Number, Video Title,</w:t>
-            </w:r>
-          </w:p>
-          <w:p>
+              <w:t>(</w:t>
+            </w:r>
+            <w:proofErr w:type="gramEnd"/>
             <w:r>
               <w:rPr>
                 <w:rFonts w:ascii="Courier New" w:eastAsia="Courier New" w:hAnsi="Courier New" w:cs="Courier New"/>
                 <w:sz w:val="18"/>
                 <w:szCs w:val="18"/>
               </w:rPr>
-              <w:lastRenderedPageBreak/>
+              <w:t>Transaction ID (FK), Video ID, Video Copy Number, Video Title,</w:t>
+            </w:r>
+          </w:p>
+          <w:p>
+            <w:r>
+              <w:rPr>
+                <w:rFonts w:ascii="Courier New" w:eastAsia="Courier New" w:hAnsi="Courier New" w:cs="Courier New"/>
+                <w:sz w:val="18"/>
+                <w:szCs w:val="18"/>
+              </w:rPr>
               <w:t>Video Return Date, Video Rental Charge Current, Video Rental Charge Historical)</w:t>
             </w:r>
           </w:p>
@@ -8275,7 +7954,6 @@
           <w:b/>
           <w:bCs/>
         </w:rPr>
-        <w:lastRenderedPageBreak/>
         <w:t>2NF</w:t>
       </w:r>
     </w:p>
@@ -8300,12 +7978,6 @@
         <w:gridCol w:w="8640"/>
       </w:tblGrid>
       <w:tr>
-        <w:tblPrEx>
-          <w:tblCellMar>
-            <w:top w:w="0" w:type="dxa"/>
-            <w:bottom w:w="0" w:type="dxa"/>
-          </w:tblCellMar>
-        </w:tblPrEx>
         <w:tc>
           <w:tcPr>
             <w:tcW w:w="8640" w:type="dxa"/>
@@ -8324,22 +7996,32 @@
             </w:tcMar>
           </w:tcPr>
           <w:p>
+            <w:proofErr w:type="gramStart"/>
             <w:r>
               <w:rPr>
                 <w:rFonts w:ascii="Courier New" w:eastAsia="Courier New" w:hAnsi="Courier New" w:cs="Courier New"/>
                 <w:sz w:val="18"/>
                 <w:szCs w:val="18"/>
               </w:rPr>
-              <w:t>Transaction(Transaction ID, Transaction Date, Customer ID, Customer First Name,</w:t>
-            </w:r>
-          </w:p>
-          <w:p>
+              <w:t>Transaction(</w:t>
+            </w:r>
+            <w:proofErr w:type="gramEnd"/>
             <w:r>
               <w:rPr>
                 <w:rFonts w:ascii="Courier New" w:eastAsia="Courier New" w:hAnsi="Courier New" w:cs="Courier New"/>
                 <w:sz w:val="18"/>
                 <w:szCs w:val="18"/>
               </w:rPr>
+              <w:t>Transaction ID, Transaction Date, Customer ID, Customer First Name,</w:t>
+            </w:r>
+          </w:p>
+          <w:p>
+            <w:r>
+              <w:rPr>
+                <w:rFonts w:ascii="Courier New" w:eastAsia="Courier New" w:hAnsi="Courier New" w:cs="Courier New"/>
+                <w:sz w:val="18"/>
+                <w:szCs w:val="18"/>
+              </w:rPr>
               <w:t>Customer Last Name, Customer Phone, Customer Street Address, Customer City,</w:t>
             </w:r>
           </w:p>
@@ -8365,6 +8047,7 @@
           </w:p>
           <w:p>
             <w:proofErr w:type="spellStart"/>
+            <w:proofErr w:type="gramStart"/>
             <w:r>
               <w:rPr>
                 <w:rFonts w:ascii="Courier New" w:eastAsia="Courier New" w:hAnsi="Courier New" w:cs="Courier New"/>
@@ -8380,16 +8063,25 @@
                 <w:sz w:val="18"/>
                 <w:szCs w:val="18"/>
               </w:rPr>
-              <w:t>(Transaction ID (FK), Video ID (FK), Video Copy Number,</w:t>
-            </w:r>
-          </w:p>
-          <w:p>
+              <w:t>(</w:t>
+            </w:r>
+            <w:proofErr w:type="gramEnd"/>
             <w:r>
               <w:rPr>
                 <w:rFonts w:ascii="Courier New" w:eastAsia="Courier New" w:hAnsi="Courier New" w:cs="Courier New"/>
                 <w:sz w:val="18"/>
                 <w:szCs w:val="18"/>
               </w:rPr>
+              <w:t>Transaction ID (FK), Video ID (FK), Video Copy Number,</w:t>
+            </w:r>
+          </w:p>
+          <w:p>
+            <w:r>
+              <w:rPr>
+                <w:rFonts w:ascii="Courier New" w:eastAsia="Courier New" w:hAnsi="Courier New" w:cs="Courier New"/>
+                <w:sz w:val="18"/>
+                <w:szCs w:val="18"/>
+              </w:rPr>
               <w:t>Video Return Date, Video Rental Charge Historical)</w:t>
             </w:r>
           </w:p>
@@ -8404,13 +8096,23 @@
             </w:r>
           </w:p>
           <w:p>
+            <w:proofErr w:type="gramStart"/>
             <w:r>
               <w:rPr>
                 <w:rFonts w:ascii="Courier New" w:eastAsia="Courier New" w:hAnsi="Courier New" w:cs="Courier New"/>
                 <w:sz w:val="18"/>
                 <w:szCs w:val="18"/>
               </w:rPr>
-              <w:t>Video(Video ID, Video Title, Video Rental Charge Current)</w:t>
+              <w:t>Video(</w:t>
+            </w:r>
+            <w:proofErr w:type="gramEnd"/>
+            <w:r>
+              <w:rPr>
+                <w:rFonts w:ascii="Courier New" w:eastAsia="Courier New" w:hAnsi="Courier New" w:cs="Courier New"/>
+                <w:sz w:val="18"/>
+                <w:szCs w:val="18"/>
+              </w:rPr>
+              <w:t>Video ID, Video Title, Video Rental Charge Current)</w:t>
             </w:r>
           </w:p>
         </w:tc>
@@ -8449,12 +8151,6 @@
         <w:gridCol w:w="8640"/>
       </w:tblGrid>
       <w:tr>
-        <w:tblPrEx>
-          <w:tblCellMar>
-            <w:top w:w="0" w:type="dxa"/>
-            <w:bottom w:w="0" w:type="dxa"/>
-          </w:tblCellMar>
-        </w:tblPrEx>
         <w:tc>
           <w:tcPr>
             <w:tcW w:w="8640" w:type="dxa"/>
@@ -8473,42 +8169,62 @@
             </w:tcMar>
           </w:tcPr>
           <w:p>
+            <w:proofErr w:type="gramStart"/>
             <w:r>
               <w:rPr>
                 <w:rFonts w:ascii="Courier New" w:eastAsia="Courier New" w:hAnsi="Courier New" w:cs="Courier New"/>
                 <w:sz w:val="18"/>
                 <w:szCs w:val="18"/>
               </w:rPr>
-              <w:t>Transaction(Transaction ID, Transaction Date, Customer ID (FK), Transaction GST)</w:t>
-            </w:r>
-          </w:p>
-          <w:p>
+              <w:t>Transaction(</w:t>
+            </w:r>
+            <w:proofErr w:type="gramEnd"/>
             <w:r>
               <w:rPr>
                 <w:rFonts w:ascii="Courier New" w:eastAsia="Courier New" w:hAnsi="Courier New" w:cs="Courier New"/>
                 <w:sz w:val="18"/>
                 <w:szCs w:val="18"/>
               </w:rPr>
+              <w:t>Transaction ID, Transaction Date, Customer ID (FK), Transaction GST)</w:t>
+            </w:r>
+          </w:p>
+          <w:p>
+            <w:r>
+              <w:rPr>
+                <w:rFonts w:ascii="Courier New" w:eastAsia="Courier New" w:hAnsi="Courier New" w:cs="Courier New"/>
+                <w:sz w:val="18"/>
+                <w:szCs w:val="18"/>
+              </w:rPr>
               <w:t xml:space="preserve"> </w:t>
             </w:r>
           </w:p>
           <w:p>
+            <w:proofErr w:type="gramStart"/>
             <w:r>
               <w:rPr>
                 <w:rFonts w:ascii="Courier New" w:eastAsia="Courier New" w:hAnsi="Courier New" w:cs="Courier New"/>
                 <w:sz w:val="18"/>
                 <w:szCs w:val="18"/>
               </w:rPr>
-              <w:t>Customer(Customer ID, Customer First Name, Customer Last Name, Customer Phone,</w:t>
-            </w:r>
-          </w:p>
-          <w:p>
+              <w:t>Customer(</w:t>
+            </w:r>
+            <w:proofErr w:type="gramEnd"/>
             <w:r>
               <w:rPr>
                 <w:rFonts w:ascii="Courier New" w:eastAsia="Courier New" w:hAnsi="Courier New" w:cs="Courier New"/>
                 <w:sz w:val="18"/>
                 <w:szCs w:val="18"/>
               </w:rPr>
+              <w:t>Customer ID, Customer First Name, Customer Last Name, Customer Phone,</w:t>
+            </w:r>
+          </w:p>
+          <w:p>
+            <w:r>
+              <w:rPr>
+                <w:rFonts w:ascii="Courier New" w:eastAsia="Courier New" w:hAnsi="Courier New" w:cs="Courier New"/>
+                <w:sz w:val="18"/>
+                <w:szCs w:val="18"/>
+              </w:rPr>
               <w:t>Customer Street Address, Customer City, Customer Province, Customer Postal Code)</w:t>
             </w:r>
           </w:p>
@@ -8524,6 +8240,7 @@
           </w:p>
           <w:p>
             <w:proofErr w:type="spellStart"/>
+            <w:proofErr w:type="gramStart"/>
             <w:r>
               <w:rPr>
                 <w:rFonts w:ascii="Courier New" w:eastAsia="Courier New" w:hAnsi="Courier New" w:cs="Courier New"/>
@@ -8539,16 +8256,25 @@
                 <w:sz w:val="18"/>
                 <w:szCs w:val="18"/>
               </w:rPr>
-              <w:t>(Transaction ID (FK), Video ID (FK), Video Copy Number,</w:t>
-            </w:r>
-          </w:p>
-          <w:p>
+              <w:t>(</w:t>
+            </w:r>
+            <w:proofErr w:type="gramEnd"/>
             <w:r>
               <w:rPr>
                 <w:rFonts w:ascii="Courier New" w:eastAsia="Courier New" w:hAnsi="Courier New" w:cs="Courier New"/>
                 <w:sz w:val="18"/>
                 <w:szCs w:val="18"/>
               </w:rPr>
+              <w:t>Transaction ID (FK), Video ID (FK), Video Copy Number,</w:t>
+            </w:r>
+          </w:p>
+          <w:p>
+            <w:r>
+              <w:rPr>
+                <w:rFonts w:ascii="Courier New" w:eastAsia="Courier New" w:hAnsi="Courier New" w:cs="Courier New"/>
+                <w:sz w:val="18"/>
+                <w:szCs w:val="18"/>
+              </w:rPr>
               <w:t>Video Return Date, Video Rental Charge Historical)</w:t>
             </w:r>
           </w:p>
@@ -8563,13 +8289,23 @@
             </w:r>
           </w:p>
           <w:p>
+            <w:proofErr w:type="gramStart"/>
             <w:r>
               <w:rPr>
                 <w:rFonts w:ascii="Courier New" w:eastAsia="Courier New" w:hAnsi="Courier New" w:cs="Courier New"/>
                 <w:sz w:val="18"/>
                 <w:szCs w:val="18"/>
               </w:rPr>
-              <w:t>Video(Video ID, Video Title, Video Rental Charge Current)</w:t>
+              <w:t>Video(</w:t>
+            </w:r>
+            <w:proofErr w:type="gramEnd"/>
+            <w:r>
+              <w:rPr>
+                <w:rFonts w:ascii="Courier New" w:eastAsia="Courier New" w:hAnsi="Courier New" w:cs="Courier New"/>
+                <w:sz w:val="18"/>
+                <w:szCs w:val="18"/>
+              </w:rPr>
+              <w:t>Video ID, Video Title, Video Rental Charge Current)</w:t>
             </w:r>
           </w:p>
         </w:tc>

</xml_diff>